<commit_message>
feat: Add Bicep templates and Dockerfiles for OECD Quality Checker deployment
- Create .env.example for environment configuration
- Add Azurite database queue and extent JSON files for local development
- Implement Bicep templates for pdf-pipeline, quality-api, and word-addin Container Apps
- Add deploy-all.ps1 script for end-to-end deployment to Azure Container Apps
- Create Dockerfiles for quality-api, pdf-pipeline, and word-addin with necessary configurations
- Add .dockerignore files for source and word-addin directories to exclude unnecessary files
</commit_message>
<xml_diff>
--- a/data/test_styling_violations.docx
+++ b/data/test_styling_violations.docx
@@ -7,7 +7,10 @@
         <w:pStyle w:val="Heading1"/>
       </w:pPr>
       <w:r>
-        <w:t>Climate action and economic growth</w:t>
+        <w:rPr>
+          <w:highlight w:val="red"/>
+        </w:rPr>
+        <w:t>Climate Action and Economic Growth</w:t>
       </w:r>
     </w:p>
     <w:p>
@@ -20,25 +23,40 @@
       </w:r>
       <w:proofErr w:type="spellEnd"/>
       <w:r>
-        <w:t xml:space="preserve"> for Economic Co-operation and Development (OECD) has long advocated for policies that align environmental sustainability with economic development. This report examines the trade-offs and synergies between climate action and GDP growth across member countries.</w:t>
-      </w:r>
-    </w:p>
-    <w:p>
-      <w:r>
-        <w:t xml:space="preserve">Carbon pricing mechanisms have been adopted by 46 national and 32 subnational jurisdictions, covering approximately </w:t>
+        <w:t xml:space="preserve"> for Economic Co-operation and Development (OECD) has long advocated for policies that align environmental sustainability with economic development. This report examines the trade-offs and synergies between climate action and GDP growth across </w:t>
       </w:r>
       <w:r>
         <w:rPr>
           <w:highlight w:val="red"/>
         </w:rPr>
-        <w:t>23%</w:t>
+        <w:t xml:space="preserve">recommendations for </w:t>
       </w:r>
       <w:r>
-        <w:t xml:space="preserve"> of global greenhouse gas emissions.</w:t>
+        <w:rPr>
+          <w:highlight w:val="red"/>
+        </w:rPr>
+        <w:t>member countries</w:t>
+      </w:r>
+      <w:r>
+        <w:t>.</w:t>
       </w:r>
     </w:p>
     <w:p>
       <w:r>
+        <w:t xml:space="preserve">Carbon pricing mechanisms have been adopted by </w:t>
+      </w:r>
+      <w:r>
+        <w:rPr>
+          <w:highlight w:val="red"/>
+        </w:rPr>
+        <w:t>46</w:t>
+      </w:r>
+    </w:p>
+    <w:p>
+      <w:r>
+        <w:rPr>
+          <w:highlight w:val="red"/>
+        </w:rPr>
         <w:t>Subsidies for fossil fuels remain a significant barrier to achieving net-zero targets by 2050.</w:t>
       </w:r>
     </w:p>
@@ -57,13 +75,7 @@
       </w:r>
       <w:proofErr w:type="spellEnd"/>
       <w:r>
-        <w:t xml:space="preserve"> for Economic Co-operation and Development (OECD) </w:t>
-      </w:r>
-      <w:r>
-        <w:rPr>
-          <w:highlight w:val="red"/>
-        </w:rPr>
-        <w:t>Economic Outlook 2024</w:t>
+        <w:t xml:space="preserve"> for Economic Co-operation and Development (OECD) Economic Outlook 2024</w:t>
       </w:r>
       <w:r>
         <w:t>, fiscal consolidation remains a priority for many member states.</w:t>
@@ -77,7 +89,7 @@
         <w:rPr>
           <w:highlight w:val="red"/>
         </w:rPr>
-        <w:t>1.1</w:t>
+        <w:t>1.1 degrees Celsius</w:t>
       </w:r>
       <w:r>
         <w:t xml:space="preserve"> since the pre-industrial era.</w:t>
@@ -88,13 +100,10 @@
         <w:t xml:space="preserve">The recommended limit is 350 ppm of </w:t>
       </w:r>
       <w:r>
-        <w:t xml:space="preserve">carbon dioxide </w:t>
-      </w:r>
-      <w:r>
         <w:rPr>
           <w:highlight w:val="red"/>
         </w:rPr>
-        <w:t>(CO2)</w:t>
+        <w:t>carbon dioxide</w:t>
       </w:r>
       <w:r>
         <w:t xml:space="preserve"> in the atmosphere.</w:t>
@@ -102,6 +111,9 @@
     </w:p>
     <w:p>
       <w:r>
+        <w:rPr>
+          <w:highlight w:val="red"/>
+        </w:rPr>
         <w:t>Key Findings</w:t>
       </w:r>
     </w:p>
@@ -112,23 +124,32 @@
     </w:p>
     <w:p>
       <w:r>
+        <w:t xml:space="preserve">Recommendations for </w:t>
+      </w:r>
+      <w:r>
         <w:rPr>
           <w:highlight w:val="red"/>
         </w:rPr>
-        <w:t>Recommendations for member countries</w:t>
+        <w:t>member countries</w:t>
       </w:r>
     </w:p>
     <w:p>
       <w:r>
+        <w:rPr>
+          <w:highlight w:val="red"/>
+        </w:rPr>
         <w:t xml:space="preserve">For further information, see Chapter 3, </w:t>
       </w:r>
       <w:r>
         <w:rPr>
           <w:highlight w:val="red"/>
         </w:rPr>
-        <w:t>For further information, see Chapter 3, Fiscal Instruments for Climate Policy, in the companion volume.</w:t>
+        <w:t>Fiscal Instruments for Climate Policy</w:t>
       </w:r>
       <w:r>
+        <w:rPr>
+          <w:highlight w:val="red"/>
+        </w:rPr>
         <w:t>, in the companion volume.</w:t>
       </w:r>
     </w:p>

</xml_diff>